<commit_message>
Inseri nome dos alunos
</commit_message>
<xml_diff>
--- a/Sprint Review.docx
+++ b/Sprint Review.docx
@@ -53,17 +53,7 @@
           <w:sz w:val="24"/>
           <w:szCs w:val="24"/>
         </w:rPr>
-        <w:t>Disciplin</w:t>
-      </w:r>
-      <w:bookmarkStart w:id="0" w:name="_GoBack"/>
-      <w:bookmarkEnd w:id="0"/>
-      <w:r>
-        <w:rPr>
-          <w:rFonts w:ascii="Arial" w:hAnsi="Arial" w:cs="Arial"/>
-          <w:sz w:val="24"/>
-          <w:szCs w:val="24"/>
-        </w:rPr>
-        <w:t>a: Engenharia de Software</w:t>
+        <w:t>Disciplina: Engenharia de Software</w:t>
       </w:r>
     </w:p>
     <w:p>
@@ -82,6 +72,14 @@
           <w:szCs w:val="24"/>
         </w:rPr>
         <w:t>Alunos: Rafael Messias de Souza Torres</w:t>
+      </w:r>
+      <w:r>
+        <w:rPr>
+          <w:rFonts w:ascii="Arial" w:hAnsi="Arial" w:cs="Arial"/>
+          <w:sz w:val="24"/>
+          <w:szCs w:val="24"/>
+        </w:rPr>
+        <w:t>; Ana Paula; Maria; João Pedro; João Lázaro; Fabrícia; Kerollayne</w:t>
       </w:r>
     </w:p>
     <w:p>
@@ -283,15 +281,8 @@
           <w:szCs w:val="24"/>
         </w:rPr>
       </w:pPr>
-    </w:p>
-    <w:p>
-      <w:pPr>
-        <w:rPr>
-          <w:rFonts w:ascii="Arial" w:hAnsi="Arial" w:cs="Arial"/>
-          <w:sz w:val="24"/>
-          <w:szCs w:val="24"/>
-        </w:rPr>
-      </w:pPr>
+      <w:bookmarkStart w:id="0" w:name="_GoBack"/>
+      <w:bookmarkEnd w:id="0"/>
     </w:p>
     <w:p>
       <w:pPr>
@@ -760,16 +751,7 @@
           <w:szCs w:val="24"/>
           <w:shd w:val="clear" w:color="auto" w:fill="F9F9F9"/>
         </w:rPr>
-        <w:t>E</w:t>
-      </w:r>
-      <w:r>
-        <w:rPr>
-          <w:rFonts w:ascii="Arial" w:hAnsi="Arial" w:cs="Arial"/>
-          <w:sz w:val="24"/>
-          <w:szCs w:val="24"/>
-          <w:shd w:val="clear" w:color="auto" w:fill="F9F9F9"/>
-        </w:rPr>
-        <w:t>xplicação detalhada do tema do grupo.</w:t>
+        <w:t>Explicação detalhada do tema do grupo.</w:t>
       </w:r>
     </w:p>
     <w:p>
@@ -5446,7 +5428,7 @@
 </file>
 
 <file path=customXml/itemProps1.xml><?xml version="1.0" encoding="utf-8"?>
-<ds:datastoreItem xmlns:ds="http://schemas.openxmlformats.org/officeDocument/2006/customXml" ds:itemID="{2BA3913F-C1EC-42D5-8AD1-07AD9D4F441B}">
+<ds:datastoreItem xmlns:ds="http://schemas.openxmlformats.org/officeDocument/2006/customXml" ds:itemID="{AA36F69B-D70B-4A5C-950B-9A63952CC7E3}">
   <ds:schemaRefs>
     <ds:schemaRef ds:uri="http://schemas.openxmlformats.org/officeDocument/2006/bibliography"/>
   </ds:schemaRefs>

</xml_diff>